<commit_message>
Fix previous and next page navigation
</commit_message>
<xml_diff>
--- a/main/dev/books/input/mangala-suththa.docx
+++ b/main/dev/books/input/mangala-suththa.docx
@@ -19,7 +19,7 @@
     </w:p>
     <w:p>
       <w:pPr>
-        <w:pStyle w:val="Heading1"/>
+        <w:pStyle w:val="Heading2"/>
         <w:rPr>
           <w:lang w:bidi="si-LK"/>
         </w:rPr>
@@ -9535,11 +9535,30 @@
     </w:p>
     <w:p>
       <w:pPr>
-        <w:rPr>
-          <w:rFonts w:cs="Iskoola Pota"/>
+        <w:pStyle w:val="Heading1"/>
+        <w:rPr>
+          <w:rFonts w:hint="cs"/>
           <w:lang w:bidi="si-LK"/>
         </w:rPr>
       </w:pPr>
+      <w:proofErr w:type="spellStart"/>
+      <w:r>
+        <w:rPr>
+          <w:rFonts w:hint="cs"/>
+          <w:cs/>
+          <w:lang w:bidi="si-LK"/>
+        </w:rPr>
+        <w:t>හතරවන</w:t>
+      </w:r>
+      <w:proofErr w:type="spellEnd"/>
+      <w:r>
+        <w:rPr>
+          <w:rFonts w:hint="cs"/>
+          <w:cs/>
+          <w:lang w:bidi="si-LK"/>
+        </w:rPr>
+        <w:t xml:space="preserve"> ගාථාව</w:t>
+      </w:r>
     </w:p>
     <w:p>
       <w:r>
@@ -9557,40 +9576,6 @@
           <w:lang w:bidi="si-LK"/>
         </w:rPr>
         <w:t xml:space="preserve"> </w:t>
-      </w:r>
-      <w:proofErr w:type="spellStart"/>
-      <w:r>
-        <w:rPr>
-          <w:rStyle w:val="Heading1Char"/>
-          <w:cs/>
-          <w:lang w:bidi="si-LK"/>
-        </w:rPr>
-        <w:t>හතරව</w:t>
-      </w:r>
-      <w:r>
-        <w:rPr>
-          <w:rStyle w:val="Heading1Char"/>
-          <w:cs/>
-          <w:lang w:bidi="si-LK"/>
-        </w:rPr>
-        <w:t>න</w:t>
-      </w:r>
-      <w:proofErr w:type="spellEnd"/>
-      <w:r>
-        <w:rPr>
-          <w:rStyle w:val="Heading1Char"/>
-          <w:cs/>
-          <w:lang w:bidi="si-LK"/>
-        </w:rPr>
-        <w:t xml:space="preserve"> </w:t>
-      </w:r>
-      <w:r>
-        <w:rPr>
-          <w:rStyle w:val="Heading1Char"/>
-          <w:cs/>
-          <w:lang w:bidi="si-LK"/>
-        </w:rPr>
-        <w:t>ගාථාව</w:t>
       </w:r>
     </w:p>
     <w:p>
@@ -13623,6 +13608,32 @@
       </w:r>
     </w:p>
     <w:p>
+      <w:pPr>
+        <w:pStyle w:val="Heading1"/>
+        <w:rPr>
+          <w:lang w:bidi="si-LK"/>
+        </w:rPr>
+      </w:pPr>
+      <w:proofErr w:type="spellStart"/>
+      <w:r>
+        <w:rPr>
+          <w:rFonts w:hint="cs"/>
+          <w:cs/>
+          <w:lang w:bidi="si-LK"/>
+        </w:rPr>
+        <w:t>පස්වන</w:t>
+      </w:r>
+      <w:proofErr w:type="spellEnd"/>
+      <w:r>
+        <w:rPr>
+          <w:rFonts w:hint="cs"/>
+          <w:cs/>
+          <w:lang w:bidi="si-LK"/>
+        </w:rPr>
+        <w:t xml:space="preserve"> ගාථාව</w:t>
+      </w:r>
+    </w:p>
+    <w:p>
       <w:r>
         <w:rPr>
           <w:rFonts w:cs="Iskoola Pota"/>
@@ -13630,24 +13641,6 @@
           <w:lang w:bidi="si-LK"/>
         </w:rPr>
         <w:t>​</w:t>
-      </w:r>
-      <w:proofErr w:type="spellStart"/>
-      <w:r>
-        <w:rPr>
-          <w:rStyle w:val="Heading1Char"/>
-          <w:cs/>
-          <w:lang w:bidi="si-LK"/>
-        </w:rPr>
-        <w:t>පස්වන</w:t>
-      </w:r>
-      <w:proofErr w:type="spellEnd"/>
-      <w:r>
-        <w:rPr>
-          <w:rStyle w:val="Heading1Char"/>
-          <w:cs/>
-          <w:lang w:bidi="si-LK"/>
-        </w:rPr>
-        <w:t xml:space="preserve"> ගාථාව</w:t>
       </w:r>
     </w:p>
     <w:p>
@@ -43298,19 +43291,11 @@
       <w:pPr>
         <w:pStyle w:val="Heading1"/>
       </w:pPr>
-      <w:proofErr w:type="spellStart"/>
-      <w:r>
-        <w:rPr>
-          <w:cs/>
-        </w:rPr>
-        <w:t>එකොළොස්වන</w:t>
-      </w:r>
-      <w:proofErr w:type="spellEnd"/>
-      <w:r>
-        <w:rPr>
-          <w:cs/>
-        </w:rPr>
-        <w:t xml:space="preserve"> ගාථාව</w:t>
+      <w:r>
+        <w:rPr>
+          <w:cs/>
+        </w:rPr>
+        <w:t>එකොළොස්වන ගාථාව</w:t>
       </w:r>
     </w:p>
     <w:p>
@@ -45794,7 +45779,6 @@
   <w:style w:type="character" w:default="1" w:styleId="DefaultParagraphFont">
     <w:name w:val="Default Paragraph Font"/>
     <w:uiPriority w:val="1"/>
-    <w:semiHidden/>
     <w:unhideWhenUsed/>
   </w:style>
   <w:style w:type="table" w:default="1" w:styleId="TableNormal">

</xml_diff>